<commit_message>
Add Ubumuntu Arts Festival metrics to TrioDigital entry
Attribute the festival's Instagram results (1M+ views, 173,922 accounts
reached) to Kevin's supporting creative contribution. Update PDF, Word and
HTML source together.

Co-Authored-By: Claude Opus 4.8 <noreply@anthropic.com>
Claude-Session: https://claude.ai/code/session_01Bf9of7CkAZGsogjRnE3dcR
</commit_message>
<xml_diff>
--- a/documentation/Kevin Tambo CV - Sep 26.docx
+++ b/documentation/Kevin Tambo CV - Sep 26.docx
@@ -1208,7 +1208,7 @@
           <w:sz w:val="18"/>
           <w:szCs w:val="18"/>
         </w:rPr>
-        <w:t xml:space="preserve">Campaign creative for the </w:t>
+        <w:t xml:space="preserve">Contributed creative to the </w:t>
       </w:r>
       <w:r>
         <w:rPr>
@@ -1228,7 +1228,47 @@
           <w:sz w:val="18"/>
           <w:szCs w:val="18"/>
         </w:rPr>
-        <w:t xml:space="preserve"> (Kigali, Rwanda) across its social platforms.</w:t>
+        <w:t xml:space="preserve"> campaign (Kigali, Rwanda) — a festival push that reached </w:t>
+      </w:r>
+      <w:r>
+        <w:rPr>
+          <w:b/>
+          <w:bCs/>
+          <w:color w:val="2A3550"/>
+          <w:sz w:val="18"/>
+          <w:szCs w:val="18"/>
+        </w:rPr>
+        <w:t xml:space="preserve">1M+ Instagram views</w:t>
+      </w:r>
+      <w:r>
+        <w:rPr>
+          <w:b w:val="false"/>
+          <w:bCs w:val="false"/>
+          <w:color w:val="2A3550"/>
+          <w:sz w:val="18"/>
+          <w:szCs w:val="18"/>
+        </w:rPr>
+        <w:t xml:space="preserve"> and </w:t>
+      </w:r>
+      <w:r>
+        <w:rPr>
+          <w:b/>
+          <w:bCs/>
+          <w:color w:val="2A3550"/>
+          <w:sz w:val="18"/>
+          <w:szCs w:val="18"/>
+        </w:rPr>
+        <w:t xml:space="preserve">173,922 accounts</w:t>
+      </w:r>
+      <w:r>
+        <w:rPr>
+          <w:b w:val="false"/>
+          <w:bCs w:val="false"/>
+          <w:color w:val="2A3550"/>
+          <w:sz w:val="18"/>
+          <w:szCs w:val="18"/>
+        </w:rPr>
+        <w:t xml:space="preserve">.</w:t>
       </w:r>
     </w:p>
     <w:p>

</xml_diff>

<commit_message>
Reframe Najenga around its documented cost/timeline record and insights
Update Najenga in the OKJTechnologies flagship line and the Selected Projects
card (PDF, Word, HTML) to lead with its core deliverable: a documented, ordered
record of a project's drawings, costs and timeline that turns site data into
actionable insights — with OCR drawing search and region-level annotation as
supporting features.

Co-Authored-By: Claude Opus 4.8 <noreply@anthropic.com>
Claude-Session: https://claude.ai/code/session_01Bf9of7CkAZGsogjRnE3dcR
</commit_message>
<xml_diff>
--- a/documentation/Kevin Tambo CV - Sep 26.docx
+++ b/documentation/Kevin Tambo CV - Sep 26.docx
@@ -409,7 +409,7 @@
           <w:sz w:val="18"/>
           <w:szCs w:val="18"/>
         </w:rPr>
-        <w:t xml:space="preserve"> (construction collaboration — drawing annotation, budgets, OCR search), </w:t>
+        <w:t xml:space="preserve"> (construction collaboration — a documented cost &amp; timeline record with OCR drawing search), </w:t>
       </w:r>
       <w:r>
         <w:rPr>
@@ -1482,7 +1482,7 @@
           <w:sz w:val="18"/>
           <w:szCs w:val="18"/>
         </w:rPr>
-        <w:t xml:space="preserve">— construction collaboration: drawings, budgets, timelines and conversations in one live view.  Laravel · React · Meilisearch · Tesseract OCR.</w:t>
+        <w:t xml:space="preserve">— keeps a documented, ordered record of a project's drawings, costs and timeline, turning site data into actionable insights; plus OCR drawing search and region-level annotation.  Laravel · React · Meilisearch · Tesseract OCR.</w:t>
       </w:r>
     </w:p>
     <w:p>

</xml_diff>